<commit_message>
Update Ifremer documenation formatting and add upload tips
</commit_message>
<xml_diff>
--- a/Ifremer-isms-documentation/Ifremer 2026 ISMS Notes.docx
+++ b/Ifremer-isms-documentation/Ifremer 2026 ISMS Notes.docx
@@ -4,7 +4,7 @@
   <w:body>
     <w:p>
       <w:pPr>
-        <w:pStyle w:val="Heading1"/>
+        <w:pStyle w:val="Title"/>
         <w:rPr>
           <w:rFonts w:ascii="Times New Roman" w:hAnsi="Times New Roman" w:cs="Times New Roman"/>
         </w:rPr>
@@ -81,8 +81,40 @@
         </w:numPr>
       </w:pPr>
       <w:r>
-        <w:t>Legacy-Modified: TODO add link</w:t>
-      </w:r>
+        <w:t>Legacy-</w:t>
+      </w:r>
+      <w:r>
+        <w:t>Compatible</w:t>
+      </w:r>
+      <w:r>
+        <w:t>:</w:t>
+      </w:r>
+      <w:hyperlink r:id="rId5" w:history="1">
+        <w:r>
+          <w:rPr>
+            <w:rStyle w:val="Hyperlink"/>
+          </w:rPr>
+          <w:t xml:space="preserve"> </w:t>
+        </w:r>
+        <w:r>
+          <w:rPr>
+            <w:rStyle w:val="Hyperlink"/>
+          </w:rPr>
+          <w:t>https://github.com/Girguis-Lab/In-Situ-Mass-Spec/blob/ifremer-2026-build/Legacy-ISMS-firmw</w:t>
+        </w:r>
+        <w:r>
+          <w:rPr>
+            <w:rStyle w:val="Hyperlink"/>
+          </w:rPr>
+          <w:t>a</w:t>
+        </w:r>
+        <w:r>
+          <w:rPr>
+            <w:rStyle w:val="Hyperlink"/>
+          </w:rPr>
+          <w:t>re-Ifremer-2026/Legacy-ISMS-firmware-Ifremer-2026.ino</w:t>
+        </w:r>
+      </w:hyperlink>
     </w:p>
     <w:p>
       <w:pPr>
@@ -93,105 +125,16 @@
         </w:numPr>
       </w:pPr>
       <w:r>
-        <w:t>Modern: TODO add link</w:t>
-      </w:r>
-    </w:p>
-    <w:p>
-      <w:pPr>
-        <w:rPr>
-          <w:b/>
-          <w:bCs/>
-        </w:rPr>
-      </w:pPr>
-      <w:r>
-        <w:rPr>
-          <w:b/>
-          <w:bCs/>
-        </w:rPr>
-        <w:t xml:space="preserve">Uploading </w:t>
-      </w:r>
-      <w:r>
-        <w:rPr>
-          <w:b/>
-          <w:bCs/>
-        </w:rPr>
-        <w:t>firmware</w:t>
-      </w:r>
-      <w:r>
-        <w:rPr>
-          <w:b/>
-          <w:bCs/>
-        </w:rPr>
-        <w:t>:</w:t>
-      </w:r>
-    </w:p>
-    <w:p>
-      <w:r>
-        <w:t xml:space="preserve">To upload </w:t>
-      </w:r>
-      <w:r>
-        <w:t>firmware</w:t>
-      </w:r>
-      <w:r>
-        <w:t>, use a USB-B cable attached to the Arduino without the rest of the  instrument powered on. You must DISCONNECT the red/orange serial cable at the Arduino pins 0&amp;1 before uploading code. Once done, reconnect the serial cable to the Arduino mega shield with the red wire in Arduino pin 0 (RX0) and the orange wire in pin 1 (TX1) /</w:t>
-      </w:r>
-    </w:p>
-    <w:p>
-      <w:r>
-        <w:t>compile and upload code:</w:t>
-      </w:r>
-    </w:p>
-    <w:p>
-      <w:pPr>
-        <w:pStyle w:val="ListParagraph"/>
-        <w:numPr>
-          <w:ilvl w:val="0"/>
-          <w:numId w:val="3"/>
-        </w:numPr>
-      </w:pPr>
-      <w:r>
-        <w:t>L</w:t>
-      </w:r>
-      <w:r>
-        <w:t xml:space="preserve">egacy code </w:t>
-      </w:r>
-      <w:proofErr w:type="gramStart"/>
-      <w:r>
-        <w:t>use</w:t>
-      </w:r>
-      <w:proofErr w:type="gramEnd"/>
-      <w:r>
-        <w:t xml:space="preserve"> the Arduino IDE</w:t>
-      </w:r>
-      <w:r>
-        <w:t>.</w:t>
-      </w:r>
-    </w:p>
-    <w:p>
-      <w:pPr>
-        <w:pStyle w:val="ListParagraph"/>
-        <w:numPr>
-          <w:ilvl w:val="0"/>
-          <w:numId w:val="3"/>
-        </w:numPr>
-      </w:pPr>
-      <w:r>
-        <w:t xml:space="preserve">Modern code, use </w:t>
-      </w:r>
-      <w:proofErr w:type="spellStart"/>
-      <w:r>
-        <w:t>VSCode</w:t>
-      </w:r>
-      <w:proofErr w:type="spellEnd"/>
-      <w:r>
-        <w:t xml:space="preserve"> IDE with the </w:t>
-      </w:r>
-      <w:r>
-        <w:t>P</w:t>
-      </w:r>
-      <w:r>
-        <w:t>latform.io extension.</w:t>
-      </w:r>
+        <w:t xml:space="preserve">Modern: </w:t>
+      </w:r>
+      <w:hyperlink r:id="rId6" w:history="1">
+        <w:r>
+          <w:rPr>
+            <w:rStyle w:val="Hyperlink"/>
+          </w:rPr>
+          <w:t>https://github.com/Girguis-Lab/In-Situ-Mass-Spec/tree/ifremer-2026-build/</w:t>
+        </w:r>
+      </w:hyperlink>
     </w:p>
     <w:p>
       <w:pPr>
@@ -349,54 +292,11 @@
       </w:r>
     </w:p>
     <w:p>
-      <w:pPr>
-        <w:ind w:left="360"/>
-      </w:pPr>
-    </w:p>
-    <w:p>
-      <w:pPr>
-        <w:ind w:left="360"/>
-      </w:pPr>
-    </w:p>
-    <w:p>
-      <w:pPr>
-        <w:ind w:left="360"/>
-      </w:pPr>
-    </w:p>
-    <w:p>
-      <w:pPr>
-        <w:ind w:left="360"/>
-      </w:pPr>
-    </w:p>
-    <w:p>
-      <w:pPr>
-        <w:ind w:left="360"/>
-      </w:pPr>
-    </w:p>
-    <w:p>
-      <w:pPr>
-        <w:ind w:left="360"/>
-      </w:pPr>
-    </w:p>
-    <w:p>
-      <w:pPr>
-        <w:ind w:left="360"/>
-      </w:pPr>
-    </w:p>
-    <w:p>
-      <w:pPr>
-        <w:ind w:left="360"/>
-      </w:pPr>
+      <w:r>
+        <w:t xml:space="preserve">&gt; </w:t>
+      </w:r>
       <w:r>
         <w:t>Major Component schematic as shown with only ground wires visible:</w:t>
-      </w:r>
-    </w:p>
-    <w:p>
-      <w:pPr>
-        <w:ind w:left="360"/>
-      </w:pPr>
-      <w:r>
-        <w:t xml:space="preserve"> </w:t>
       </w:r>
       <w:r>
         <w:br/>
@@ -406,9 +306,9 @@
           <w:noProof/>
         </w:rPr>
         <w:drawing>
-          <wp:inline distT="0" distB="0" distL="0" distR="0" wp14:anchorId="7A752C9B" wp14:editId="677CED77">
-            <wp:extent cx="5943600" cy="4269105"/>
-            <wp:effectExtent l="0" t="0" r="0" b="0"/>
+          <wp:inline distT="0" distB="0" distL="0" distR="0" wp14:anchorId="7A752C9B" wp14:editId="5AF00254">
+            <wp:extent cx="4883922" cy="3507970"/>
+            <wp:effectExtent l="0" t="0" r="5715" b="0"/>
             <wp:docPr id="321576309" name="Picture 2"/>
             <wp:cNvGraphicFramePr>
               <a:graphicFrameLocks xmlns:a="http://schemas.openxmlformats.org/drawingml/2006/main" noChangeAspect="1"/>
@@ -421,7 +321,7 @@
                     <pic:cNvPicPr/>
                   </pic:nvPicPr>
                   <pic:blipFill>
-                    <a:blip r:embed="rId5" cstate="print">
+                    <a:blip r:embed="rId7" cstate="print">
                       <a:extLst>
                         <a:ext uri="{28A0092B-C50C-407E-A947-70E740481C1C}">
                           <a14:useLocalDpi xmlns:a14="http://schemas.microsoft.com/office/drawing/2010/main" val="0"/>
@@ -435,7 +335,7 @@
                   <pic:spPr>
                     <a:xfrm>
                       <a:off x="0" y="0"/>
-                      <a:ext cx="5943600" cy="4269105"/>
+                      <a:ext cx="4968782" cy="3568922"/>
                     </a:xfrm>
                     <a:prstGeom prst="rect">
                       <a:avLst/>
@@ -466,6 +366,7 @@
         </w:numPr>
       </w:pPr>
       <w:r>
+        <w:lastRenderedPageBreak/>
         <w:t xml:space="preserve">As built the RGA rs232 cable has all 9 wires connected – many can be omitted and the instrument </w:t>
       </w:r>
       <w:proofErr w:type="spellStart"/>
@@ -498,7 +399,6 @@
         </w:numPr>
       </w:pPr>
       <w:r>
-        <w:lastRenderedPageBreak/>
         <w:t>Follow this wiring schematic</w:t>
       </w:r>
       <w:r>
@@ -507,17 +407,19 @@
       <w:r>
         <w:t>to pass the minimum required number of wires between the RS232 RGA and laptop topside RS232 Adapter:</w:t>
       </w:r>
-      <w:r>
-        <w:br/>
-      </w:r>
+    </w:p>
+    <w:p>
+      <w:pPr>
+        <w:ind w:left="1080"/>
+      </w:pPr>
       <w:r>
         <w:rPr>
           <w:noProof/>
         </w:rPr>
         <w:drawing>
-          <wp:inline distT="0" distB="0" distL="0" distR="0" wp14:anchorId="4450BCD3" wp14:editId="1DA5FA20">
-            <wp:extent cx="2903838" cy="1700421"/>
-            <wp:effectExtent l="0" t="0" r="5080" b="1905"/>
+          <wp:inline distT="0" distB="0" distL="0" distR="0" wp14:anchorId="4450BCD3" wp14:editId="1F633BD2">
+            <wp:extent cx="4289367" cy="2511753"/>
+            <wp:effectExtent l="0" t="0" r="3810" b="3175"/>
             <wp:docPr id="108203059" name="Picture 1"/>
             <wp:cNvGraphicFramePr>
               <a:graphicFrameLocks xmlns:a="http://schemas.openxmlformats.org/drawingml/2006/main" noChangeAspect="1"/>
@@ -530,7 +432,7 @@
                     <pic:cNvPicPr/>
                   </pic:nvPicPr>
                   <pic:blipFill>
-                    <a:blip r:embed="rId6" cstate="print">
+                    <a:blip r:embed="rId8" cstate="print">
                       <a:extLst>
                         <a:ext uri="{28A0092B-C50C-407E-A947-70E740481C1C}">
                           <a14:useLocalDpi xmlns:a14="http://schemas.microsoft.com/office/drawing/2010/main" val="0"/>
@@ -544,7 +446,7 @@
                   <pic:spPr>
                     <a:xfrm>
                       <a:off x="0" y="0"/>
-                      <a:ext cx="2930948" cy="1716296"/>
+                      <a:ext cx="4552988" cy="2666124"/>
                     </a:xfrm>
                     <a:prstGeom prst="rect">
                       <a:avLst/>
@@ -583,7 +485,7 @@
     </w:p>
     <w:sectPr>
       <w:pgSz w:w="12240" w:h="15840"/>
-      <w:pgMar w:top="1440" w:right="1440" w:bottom="1440" w:left="1440" w:header="720" w:footer="720" w:gutter="0"/>
+      <w:pgMar w:top="1440" w:right="1440" w:bottom="144" w:left="1440" w:header="720" w:footer="720" w:gutter="0"/>
       <w:cols w:space="720"/>
       <w:docGrid w:linePitch="360"/>
     </w:sectPr>
@@ -1065,17 +967,15 @@
   <w:docDefaults>
     <w:rPrDefault>
       <w:rPr>
-        <w:rFonts w:asciiTheme="minorHAnsi" w:eastAsiaTheme="minorHAnsi" w:hAnsiTheme="minorHAnsi" w:cstheme="minorBidi"/>
-        <w:kern w:val="2"/>
-        <w:sz w:val="24"/>
-        <w:szCs w:val="24"/>
+        <w:rFonts w:asciiTheme="minorHAnsi" w:eastAsiaTheme="minorEastAsia" w:hAnsiTheme="minorHAnsi" w:cstheme="minorBidi"/>
+        <w:sz w:val="22"/>
+        <w:szCs w:val="22"/>
         <w:lang w:val="en-US" w:eastAsia="en-US" w:bidi="ar-SA"/>
-        <w14:ligatures w14:val="standardContextual"/>
       </w:rPr>
     </w:rPrDefault>
     <w:pPrDefault>
       <w:pPr>
-        <w:spacing w:after="160" w:line="278" w:lineRule="auto"/>
+        <w:spacing w:after="200" w:line="276" w:lineRule="auto"/>
       </w:pPr>
     </w:pPrDefault>
   </w:docDefaults>
@@ -1460,6 +1360,7 @@
   <w:style w:type="paragraph" w:default="1" w:styleId="Normal">
     <w:name w:val="Normal"/>
     <w:qFormat/>
+    <w:rsid w:val="004D3FBA"/>
   </w:style>
   <w:style w:type="paragraph" w:styleId="Heading1">
     <w:name w:val="heading 1"/>
@@ -1468,18 +1369,20 @@
     <w:link w:val="Heading1Char"/>
     <w:uiPriority w:val="9"/>
     <w:qFormat/>
-    <w:rsid w:val="006F3B01"/>
+    <w:rsid w:val="004D3FBA"/>
     <w:pPr>
       <w:keepNext/>
       <w:keepLines/>
-      <w:spacing w:before="360" w:after="80"/>
+      <w:spacing w:before="480" w:after="0"/>
       <w:outlineLvl w:val="0"/>
     </w:pPr>
     <w:rPr>
       <w:rFonts w:asciiTheme="majorHAnsi" w:eastAsiaTheme="majorEastAsia" w:hAnsiTheme="majorHAnsi" w:cstheme="majorBidi"/>
-      <w:color w:val="0F4761" w:themeColor="accent1" w:themeShade="BF"/>
-      <w:sz w:val="40"/>
-      <w:szCs w:val="40"/>
+      <w:b/>
+      <w:bCs/>
+      <w:color w:val="B91301" w:themeColor="accent1" w:themeShade="BF"/>
+      <w:sz w:val="28"/>
+      <w:szCs w:val="28"/>
     </w:rPr>
   </w:style>
   <w:style w:type="paragraph" w:styleId="Heading2">
@@ -1490,18 +1393,20 @@
     <w:uiPriority w:val="9"/>
     <w:unhideWhenUsed/>
     <w:qFormat/>
-    <w:rsid w:val="006F3B01"/>
+    <w:rsid w:val="004D3FBA"/>
     <w:pPr>
       <w:keepNext/>
       <w:keepLines/>
-      <w:spacing w:before="160" w:after="80"/>
+      <w:spacing w:before="200" w:after="0"/>
       <w:outlineLvl w:val="1"/>
     </w:pPr>
     <w:rPr>
       <w:rFonts w:asciiTheme="majorHAnsi" w:eastAsiaTheme="majorEastAsia" w:hAnsiTheme="majorHAnsi" w:cstheme="majorBidi"/>
-      <w:color w:val="0F4761" w:themeColor="accent1" w:themeShade="BF"/>
-      <w:sz w:val="32"/>
-      <w:szCs w:val="32"/>
+      <w:b/>
+      <w:bCs/>
+      <w:color w:val="F81B02" w:themeColor="accent1"/>
+      <w:sz w:val="26"/>
+      <w:szCs w:val="26"/>
     </w:rPr>
   </w:style>
   <w:style w:type="paragraph" w:styleId="Heading3">
@@ -1513,18 +1418,18 @@
     <w:semiHidden/>
     <w:unhideWhenUsed/>
     <w:qFormat/>
-    <w:rsid w:val="006F3B01"/>
+    <w:rsid w:val="004D3FBA"/>
     <w:pPr>
       <w:keepNext/>
       <w:keepLines/>
-      <w:spacing w:before="160" w:after="80"/>
+      <w:spacing w:before="200" w:after="0"/>
       <w:outlineLvl w:val="2"/>
     </w:pPr>
     <w:rPr>
-      <w:rFonts w:eastAsiaTheme="majorEastAsia" w:cstheme="majorBidi"/>
-      <w:color w:val="0F4761" w:themeColor="accent1" w:themeShade="BF"/>
-      <w:sz w:val="28"/>
-      <w:szCs w:val="28"/>
+      <w:rFonts w:asciiTheme="majorHAnsi" w:eastAsiaTheme="majorEastAsia" w:hAnsiTheme="majorHAnsi" w:cstheme="majorBidi"/>
+      <w:b/>
+      <w:bCs/>
+      <w:color w:val="F81B02" w:themeColor="accent1"/>
     </w:rPr>
   </w:style>
   <w:style w:type="paragraph" w:styleId="Heading4">
@@ -1536,18 +1441,20 @@
     <w:semiHidden/>
     <w:unhideWhenUsed/>
     <w:qFormat/>
-    <w:rsid w:val="006F3B01"/>
+    <w:rsid w:val="004D3FBA"/>
     <w:pPr>
       <w:keepNext/>
       <w:keepLines/>
-      <w:spacing w:before="80" w:after="40"/>
+      <w:spacing w:before="200" w:after="0"/>
       <w:outlineLvl w:val="3"/>
     </w:pPr>
     <w:rPr>
-      <w:rFonts w:eastAsiaTheme="majorEastAsia" w:cstheme="majorBidi"/>
+      <w:rFonts w:asciiTheme="majorHAnsi" w:eastAsiaTheme="majorEastAsia" w:hAnsiTheme="majorHAnsi" w:cstheme="majorBidi"/>
+      <w:b/>
+      <w:bCs/>
       <w:i/>
       <w:iCs/>
-      <w:color w:val="0F4761" w:themeColor="accent1" w:themeShade="BF"/>
+      <w:color w:val="F81B02" w:themeColor="accent1"/>
     </w:rPr>
   </w:style>
   <w:style w:type="paragraph" w:styleId="Heading5">
@@ -1559,16 +1466,16 @@
     <w:semiHidden/>
     <w:unhideWhenUsed/>
     <w:qFormat/>
-    <w:rsid w:val="006F3B01"/>
+    <w:rsid w:val="004D3FBA"/>
     <w:pPr>
       <w:keepNext/>
       <w:keepLines/>
-      <w:spacing w:before="80" w:after="40"/>
+      <w:spacing w:before="200" w:after="0"/>
       <w:outlineLvl w:val="4"/>
     </w:pPr>
     <w:rPr>
-      <w:rFonts w:eastAsiaTheme="majorEastAsia" w:cstheme="majorBidi"/>
-      <w:color w:val="0F4761" w:themeColor="accent1" w:themeShade="BF"/>
+      <w:rFonts w:asciiTheme="majorHAnsi" w:eastAsiaTheme="majorEastAsia" w:hAnsiTheme="majorHAnsi" w:cstheme="majorBidi"/>
+      <w:color w:val="7B0D01" w:themeColor="accent1" w:themeShade="7F"/>
     </w:rPr>
   </w:style>
   <w:style w:type="paragraph" w:styleId="Heading6">
@@ -1580,18 +1487,18 @@
     <w:semiHidden/>
     <w:unhideWhenUsed/>
     <w:qFormat/>
-    <w:rsid w:val="006F3B01"/>
+    <w:rsid w:val="004D3FBA"/>
     <w:pPr>
       <w:keepNext/>
       <w:keepLines/>
-      <w:spacing w:before="40" w:after="0"/>
+      <w:spacing w:before="200" w:after="0"/>
       <w:outlineLvl w:val="5"/>
     </w:pPr>
     <w:rPr>
-      <w:rFonts w:eastAsiaTheme="majorEastAsia" w:cstheme="majorBidi"/>
+      <w:rFonts w:asciiTheme="majorHAnsi" w:eastAsiaTheme="majorEastAsia" w:hAnsiTheme="majorHAnsi" w:cstheme="majorBidi"/>
       <w:i/>
       <w:iCs/>
-      <w:color w:val="595959" w:themeColor="text1" w:themeTint="A6"/>
+      <w:color w:val="7B0D01" w:themeColor="accent1" w:themeShade="7F"/>
     </w:rPr>
   </w:style>
   <w:style w:type="paragraph" w:styleId="Heading7">
@@ -1603,16 +1510,18 @@
     <w:semiHidden/>
     <w:unhideWhenUsed/>
     <w:qFormat/>
-    <w:rsid w:val="006F3B01"/>
+    <w:rsid w:val="004D3FBA"/>
     <w:pPr>
       <w:keepNext/>
       <w:keepLines/>
-      <w:spacing w:before="40" w:after="0"/>
+      <w:spacing w:before="200" w:after="0"/>
       <w:outlineLvl w:val="6"/>
     </w:pPr>
     <w:rPr>
-      <w:rFonts w:eastAsiaTheme="majorEastAsia" w:cstheme="majorBidi"/>
-      <w:color w:val="595959" w:themeColor="text1" w:themeTint="A6"/>
+      <w:rFonts w:asciiTheme="majorHAnsi" w:eastAsiaTheme="majorEastAsia" w:hAnsiTheme="majorHAnsi" w:cstheme="majorBidi"/>
+      <w:i/>
+      <w:iCs/>
+      <w:color w:val="404040" w:themeColor="text1" w:themeTint="BF"/>
     </w:rPr>
   </w:style>
   <w:style w:type="paragraph" w:styleId="Heading8">
@@ -1624,18 +1533,18 @@
     <w:semiHidden/>
     <w:unhideWhenUsed/>
     <w:qFormat/>
-    <w:rsid w:val="006F3B01"/>
+    <w:rsid w:val="004D3FBA"/>
     <w:pPr>
       <w:keepNext/>
       <w:keepLines/>
-      <w:spacing w:after="0"/>
+      <w:spacing w:before="200" w:after="0"/>
       <w:outlineLvl w:val="7"/>
     </w:pPr>
     <w:rPr>
-      <w:rFonts w:eastAsiaTheme="majorEastAsia" w:cstheme="majorBidi"/>
-      <w:i/>
-      <w:iCs/>
-      <w:color w:val="272727" w:themeColor="text1" w:themeTint="D8"/>
+      <w:rFonts w:asciiTheme="majorHAnsi" w:eastAsiaTheme="majorEastAsia" w:hAnsiTheme="majorHAnsi" w:cstheme="majorBidi"/>
+      <w:color w:val="F81B02" w:themeColor="accent1"/>
+      <w:sz w:val="20"/>
+      <w:szCs w:val="20"/>
     </w:rPr>
   </w:style>
   <w:style w:type="paragraph" w:styleId="Heading9">
@@ -1647,21 +1556,26 @@
     <w:semiHidden/>
     <w:unhideWhenUsed/>
     <w:qFormat/>
-    <w:rsid w:val="006F3B01"/>
+    <w:rsid w:val="004D3FBA"/>
     <w:pPr>
       <w:keepNext/>
       <w:keepLines/>
-      <w:spacing w:after="0"/>
+      <w:spacing w:before="200" w:after="0"/>
       <w:outlineLvl w:val="8"/>
     </w:pPr>
     <w:rPr>
-      <w:rFonts w:eastAsiaTheme="majorEastAsia" w:cstheme="majorBidi"/>
-      <w:color w:val="272727" w:themeColor="text1" w:themeTint="D8"/>
+      <w:rFonts w:asciiTheme="majorHAnsi" w:eastAsiaTheme="majorEastAsia" w:hAnsiTheme="majorHAnsi" w:cstheme="majorBidi"/>
+      <w:i/>
+      <w:iCs/>
+      <w:color w:val="404040" w:themeColor="text1" w:themeTint="BF"/>
+      <w:sz w:val="20"/>
+      <w:szCs w:val="20"/>
     </w:rPr>
   </w:style>
   <w:style w:type="character" w:default="1" w:styleId="DefaultParagraphFont">
     <w:name w:val="Default Paragraph Font"/>
     <w:uiPriority w:val="1"/>
+    <w:semiHidden/>
     <w:unhideWhenUsed/>
   </w:style>
   <w:style w:type="table" w:default="1" w:styleId="TableNormal">
@@ -1690,12 +1604,14 @@
     <w:basedOn w:val="DefaultParagraphFont"/>
     <w:link w:val="Heading1"/>
     <w:uiPriority w:val="9"/>
-    <w:rsid w:val="006F3B01"/>
+    <w:rsid w:val="004D3FBA"/>
     <w:rPr>
       <w:rFonts w:asciiTheme="majorHAnsi" w:eastAsiaTheme="majorEastAsia" w:hAnsiTheme="majorHAnsi" w:cstheme="majorBidi"/>
-      <w:color w:val="0F4761" w:themeColor="accent1" w:themeShade="BF"/>
-      <w:sz w:val="40"/>
-      <w:szCs w:val="40"/>
+      <w:b/>
+      <w:bCs/>
+      <w:color w:val="B91301" w:themeColor="accent1" w:themeShade="BF"/>
+      <w:sz w:val="28"/>
+      <w:szCs w:val="28"/>
     </w:rPr>
   </w:style>
   <w:style w:type="character" w:customStyle="1" w:styleId="Heading2Char">
@@ -1703,12 +1619,14 @@
     <w:basedOn w:val="DefaultParagraphFont"/>
     <w:link w:val="Heading2"/>
     <w:uiPriority w:val="9"/>
-    <w:rsid w:val="006F3B01"/>
+    <w:rsid w:val="004D3FBA"/>
     <w:rPr>
       <w:rFonts w:asciiTheme="majorHAnsi" w:eastAsiaTheme="majorEastAsia" w:hAnsiTheme="majorHAnsi" w:cstheme="majorBidi"/>
-      <w:color w:val="0F4761" w:themeColor="accent1" w:themeShade="BF"/>
-      <w:sz w:val="32"/>
-      <w:szCs w:val="32"/>
+      <w:b/>
+      <w:bCs/>
+      <w:color w:val="F81B02" w:themeColor="accent1"/>
+      <w:sz w:val="26"/>
+      <w:szCs w:val="26"/>
     </w:rPr>
   </w:style>
   <w:style w:type="character" w:customStyle="1" w:styleId="Heading3Char">
@@ -1717,12 +1635,12 @@
     <w:link w:val="Heading3"/>
     <w:uiPriority w:val="9"/>
     <w:semiHidden/>
-    <w:rsid w:val="006F3B01"/>
-    <w:rPr>
-      <w:rFonts w:eastAsiaTheme="majorEastAsia" w:cstheme="majorBidi"/>
-      <w:color w:val="0F4761" w:themeColor="accent1" w:themeShade="BF"/>
-      <w:sz w:val="28"/>
-      <w:szCs w:val="28"/>
+    <w:rsid w:val="004D3FBA"/>
+    <w:rPr>
+      <w:rFonts w:asciiTheme="majorHAnsi" w:eastAsiaTheme="majorEastAsia" w:hAnsiTheme="majorHAnsi" w:cstheme="majorBidi"/>
+      <w:b/>
+      <w:bCs/>
+      <w:color w:val="F81B02" w:themeColor="accent1"/>
     </w:rPr>
   </w:style>
   <w:style w:type="character" w:customStyle="1" w:styleId="Heading4Char">
@@ -1731,12 +1649,14 @@
     <w:link w:val="Heading4"/>
     <w:uiPriority w:val="9"/>
     <w:semiHidden/>
-    <w:rsid w:val="006F3B01"/>
-    <w:rPr>
-      <w:rFonts w:eastAsiaTheme="majorEastAsia" w:cstheme="majorBidi"/>
+    <w:rsid w:val="004D3FBA"/>
+    <w:rPr>
+      <w:rFonts w:asciiTheme="majorHAnsi" w:eastAsiaTheme="majorEastAsia" w:hAnsiTheme="majorHAnsi" w:cstheme="majorBidi"/>
+      <w:b/>
+      <w:bCs/>
       <w:i/>
       <w:iCs/>
-      <w:color w:val="0F4761" w:themeColor="accent1" w:themeShade="BF"/>
+      <w:color w:val="F81B02" w:themeColor="accent1"/>
     </w:rPr>
   </w:style>
   <w:style w:type="character" w:customStyle="1" w:styleId="Heading5Char">
@@ -1745,10 +1665,10 @@
     <w:link w:val="Heading5"/>
     <w:uiPriority w:val="9"/>
     <w:semiHidden/>
-    <w:rsid w:val="006F3B01"/>
-    <w:rPr>
-      <w:rFonts w:eastAsiaTheme="majorEastAsia" w:cstheme="majorBidi"/>
-      <w:color w:val="0F4761" w:themeColor="accent1" w:themeShade="BF"/>
+    <w:rsid w:val="004D3FBA"/>
+    <w:rPr>
+      <w:rFonts w:asciiTheme="majorHAnsi" w:eastAsiaTheme="majorEastAsia" w:hAnsiTheme="majorHAnsi" w:cstheme="majorBidi"/>
+      <w:color w:val="7B0D01" w:themeColor="accent1" w:themeShade="7F"/>
     </w:rPr>
   </w:style>
   <w:style w:type="character" w:customStyle="1" w:styleId="Heading6Char">
@@ -1757,12 +1677,12 @@
     <w:link w:val="Heading6"/>
     <w:uiPriority w:val="9"/>
     <w:semiHidden/>
-    <w:rsid w:val="006F3B01"/>
-    <w:rPr>
-      <w:rFonts w:eastAsiaTheme="majorEastAsia" w:cstheme="majorBidi"/>
+    <w:rsid w:val="004D3FBA"/>
+    <w:rPr>
+      <w:rFonts w:asciiTheme="majorHAnsi" w:eastAsiaTheme="majorEastAsia" w:hAnsiTheme="majorHAnsi" w:cstheme="majorBidi"/>
       <w:i/>
       <w:iCs/>
-      <w:color w:val="595959" w:themeColor="text1" w:themeTint="A6"/>
+      <w:color w:val="7B0D01" w:themeColor="accent1" w:themeShade="7F"/>
     </w:rPr>
   </w:style>
   <w:style w:type="character" w:customStyle="1" w:styleId="Heading7Char">
@@ -1771,10 +1691,12 @@
     <w:link w:val="Heading7"/>
     <w:uiPriority w:val="9"/>
     <w:semiHidden/>
-    <w:rsid w:val="006F3B01"/>
-    <w:rPr>
-      <w:rFonts w:eastAsiaTheme="majorEastAsia" w:cstheme="majorBidi"/>
-      <w:color w:val="595959" w:themeColor="text1" w:themeTint="A6"/>
+    <w:rsid w:val="004D3FBA"/>
+    <w:rPr>
+      <w:rFonts w:asciiTheme="majorHAnsi" w:eastAsiaTheme="majorEastAsia" w:hAnsiTheme="majorHAnsi" w:cstheme="majorBidi"/>
+      <w:i/>
+      <w:iCs/>
+      <w:color w:val="404040" w:themeColor="text1" w:themeTint="BF"/>
     </w:rPr>
   </w:style>
   <w:style w:type="character" w:customStyle="1" w:styleId="Heading8Char">
@@ -1783,12 +1705,12 @@
     <w:link w:val="Heading8"/>
     <w:uiPriority w:val="9"/>
     <w:semiHidden/>
-    <w:rsid w:val="006F3B01"/>
-    <w:rPr>
-      <w:rFonts w:eastAsiaTheme="majorEastAsia" w:cstheme="majorBidi"/>
-      <w:i/>
-      <w:iCs/>
-      <w:color w:val="272727" w:themeColor="text1" w:themeTint="D8"/>
+    <w:rsid w:val="004D3FBA"/>
+    <w:rPr>
+      <w:rFonts w:asciiTheme="majorHAnsi" w:eastAsiaTheme="majorEastAsia" w:hAnsiTheme="majorHAnsi" w:cstheme="majorBidi"/>
+      <w:color w:val="F81B02" w:themeColor="accent1"/>
+      <w:sz w:val="20"/>
+      <w:szCs w:val="20"/>
     </w:rPr>
   </w:style>
   <w:style w:type="character" w:customStyle="1" w:styleId="Heading9Char">
@@ -1797,10 +1719,14 @@
     <w:link w:val="Heading9"/>
     <w:uiPriority w:val="9"/>
     <w:semiHidden/>
-    <w:rsid w:val="006F3B01"/>
-    <w:rPr>
-      <w:rFonts w:eastAsiaTheme="majorEastAsia" w:cstheme="majorBidi"/>
-      <w:color w:val="272727" w:themeColor="text1" w:themeTint="D8"/>
+    <w:rsid w:val="004D3FBA"/>
+    <w:rPr>
+      <w:rFonts w:asciiTheme="majorHAnsi" w:eastAsiaTheme="majorEastAsia" w:hAnsiTheme="majorHAnsi" w:cstheme="majorBidi"/>
+      <w:i/>
+      <w:iCs/>
+      <w:color w:val="404040" w:themeColor="text1" w:themeTint="BF"/>
+      <w:sz w:val="20"/>
+      <w:szCs w:val="20"/>
     </w:rPr>
   </w:style>
   <w:style w:type="paragraph" w:styleId="Title">
@@ -1810,17 +1736,21 @@
     <w:link w:val="TitleChar"/>
     <w:uiPriority w:val="10"/>
     <w:qFormat/>
-    <w:rsid w:val="006F3B01"/>
+    <w:rsid w:val="004D3FBA"/>
     <w:pPr>
-      <w:spacing w:after="80" w:line="240" w:lineRule="auto"/>
+      <w:pBdr>
+        <w:bottom w:val="single" w:sz="8" w:space="4" w:color="F81B02" w:themeColor="accent1"/>
+      </w:pBdr>
+      <w:spacing w:after="300" w:line="240" w:lineRule="auto"/>
       <w:contextualSpacing/>
     </w:pPr>
     <w:rPr>
       <w:rFonts w:asciiTheme="majorHAnsi" w:eastAsiaTheme="majorEastAsia" w:hAnsiTheme="majorHAnsi" w:cstheme="majorBidi"/>
-      <w:spacing w:val="-10"/>
+      <w:color w:val="333333" w:themeColor="text2" w:themeShade="BF"/>
+      <w:spacing w:val="5"/>
       <w:kern w:val="28"/>
-      <w:sz w:val="56"/>
-      <w:szCs w:val="56"/>
+      <w:sz w:val="52"/>
+      <w:szCs w:val="52"/>
     </w:rPr>
   </w:style>
   <w:style w:type="character" w:customStyle="1" w:styleId="TitleChar">
@@ -1828,13 +1758,14 @@
     <w:basedOn w:val="DefaultParagraphFont"/>
     <w:link w:val="Title"/>
     <w:uiPriority w:val="10"/>
-    <w:rsid w:val="006F3B01"/>
+    <w:rsid w:val="004D3FBA"/>
     <w:rPr>
       <w:rFonts w:asciiTheme="majorHAnsi" w:eastAsiaTheme="majorEastAsia" w:hAnsiTheme="majorHAnsi" w:cstheme="majorBidi"/>
-      <w:spacing w:val="-10"/>
+      <w:color w:val="333333" w:themeColor="text2" w:themeShade="BF"/>
+      <w:spacing w:val="5"/>
       <w:kern w:val="28"/>
-      <w:sz w:val="56"/>
-      <w:szCs w:val="56"/>
+      <w:sz w:val="52"/>
+      <w:szCs w:val="52"/>
     </w:rPr>
   </w:style>
   <w:style w:type="paragraph" w:styleId="Subtitle">
@@ -1844,18 +1775,20 @@
     <w:link w:val="SubtitleChar"/>
     <w:uiPriority w:val="11"/>
     <w:qFormat/>
-    <w:rsid w:val="006F3B01"/>
+    <w:rsid w:val="004D3FBA"/>
     <w:pPr>
       <w:numPr>
         <w:ilvl w:val="1"/>
       </w:numPr>
     </w:pPr>
     <w:rPr>
-      <w:rFonts w:eastAsiaTheme="majorEastAsia" w:cstheme="majorBidi"/>
-      <w:color w:val="595959" w:themeColor="text1" w:themeTint="A6"/>
+      <w:rFonts w:asciiTheme="majorHAnsi" w:eastAsiaTheme="majorEastAsia" w:hAnsiTheme="majorHAnsi" w:cstheme="majorBidi"/>
+      <w:i/>
+      <w:iCs/>
+      <w:color w:val="F81B02" w:themeColor="accent1"/>
       <w:spacing w:val="15"/>
-      <w:sz w:val="28"/>
-      <w:szCs w:val="28"/>
+      <w:sz w:val="24"/>
+      <w:szCs w:val="24"/>
     </w:rPr>
   </w:style>
   <w:style w:type="character" w:customStyle="1" w:styleId="SubtitleChar">
@@ -1863,13 +1796,15 @@
     <w:basedOn w:val="DefaultParagraphFont"/>
     <w:link w:val="Subtitle"/>
     <w:uiPriority w:val="11"/>
-    <w:rsid w:val="006F3B01"/>
-    <w:rPr>
-      <w:rFonts w:eastAsiaTheme="majorEastAsia" w:cstheme="majorBidi"/>
-      <w:color w:val="595959" w:themeColor="text1" w:themeTint="A6"/>
+    <w:rsid w:val="004D3FBA"/>
+    <w:rPr>
+      <w:rFonts w:asciiTheme="majorHAnsi" w:eastAsiaTheme="majorEastAsia" w:hAnsiTheme="majorHAnsi" w:cstheme="majorBidi"/>
+      <w:i/>
+      <w:iCs/>
+      <w:color w:val="F81B02" w:themeColor="accent1"/>
       <w:spacing w:val="15"/>
-      <w:sz w:val="28"/>
-      <w:szCs w:val="28"/>
+      <w:sz w:val="24"/>
+      <w:szCs w:val="24"/>
     </w:rPr>
   </w:style>
   <w:style w:type="paragraph" w:styleId="Quote">
@@ -1879,15 +1814,11 @@
     <w:link w:val="QuoteChar"/>
     <w:uiPriority w:val="29"/>
     <w:qFormat/>
-    <w:rsid w:val="006F3B01"/>
-    <w:pPr>
-      <w:spacing w:before="160"/>
-      <w:jc w:val="center"/>
-    </w:pPr>
+    <w:rsid w:val="004D3FBA"/>
     <w:rPr>
       <w:i/>
       <w:iCs/>
-      <w:color w:val="404040" w:themeColor="text1" w:themeTint="BF"/>
+      <w:color w:val="000000" w:themeColor="text1"/>
     </w:rPr>
   </w:style>
   <w:style w:type="character" w:customStyle="1" w:styleId="QuoteChar">
@@ -1895,11 +1826,11 @@
     <w:basedOn w:val="DefaultParagraphFont"/>
     <w:link w:val="Quote"/>
     <w:uiPriority w:val="29"/>
-    <w:rsid w:val="006F3B01"/>
+    <w:rsid w:val="004D3FBA"/>
     <w:rPr>
       <w:i/>
       <w:iCs/>
-      <w:color w:val="404040" w:themeColor="text1" w:themeTint="BF"/>
+      <w:color w:val="000000" w:themeColor="text1"/>
     </w:rPr>
   </w:style>
   <w:style w:type="paragraph" w:styleId="ListParagraph">
@@ -1907,7 +1838,7 @@
     <w:basedOn w:val="Normal"/>
     <w:uiPriority w:val="34"/>
     <w:qFormat/>
-    <w:rsid w:val="006F3B01"/>
+    <w:rsid w:val="004D3FBA"/>
     <w:pPr>
       <w:ind w:left="720"/>
       <w:contextualSpacing/>
@@ -1918,11 +1849,13 @@
     <w:basedOn w:val="DefaultParagraphFont"/>
     <w:uiPriority w:val="21"/>
     <w:qFormat/>
-    <w:rsid w:val="006F3B01"/>
-    <w:rPr>
+    <w:rsid w:val="004D3FBA"/>
+    <w:rPr>
+      <w:b/>
+      <w:bCs/>
       <w:i/>
       <w:iCs/>
-      <w:color w:val="0F4761" w:themeColor="accent1" w:themeShade="BF"/>
+      <w:color w:val="F81B02" w:themeColor="accent1"/>
     </w:rPr>
   </w:style>
   <w:style w:type="paragraph" w:styleId="IntenseQuote">
@@ -1932,20 +1865,20 @@
     <w:link w:val="IntenseQuoteChar"/>
     <w:uiPriority w:val="30"/>
     <w:qFormat/>
-    <w:rsid w:val="006F3B01"/>
+    <w:rsid w:val="004D3FBA"/>
     <w:pPr>
       <w:pBdr>
-        <w:top w:val="single" w:sz="4" w:space="10" w:color="0F4761" w:themeColor="accent1" w:themeShade="BF"/>
-        <w:bottom w:val="single" w:sz="4" w:space="10" w:color="0F4761" w:themeColor="accent1" w:themeShade="BF"/>
+        <w:bottom w:val="single" w:sz="4" w:space="4" w:color="F81B02" w:themeColor="accent1"/>
       </w:pBdr>
-      <w:spacing w:before="360" w:after="360"/>
-      <w:ind w:left="864" w:right="864"/>
-      <w:jc w:val="center"/>
+      <w:spacing w:before="200" w:after="280"/>
+      <w:ind w:left="936" w:right="936"/>
     </w:pPr>
     <w:rPr>
+      <w:b/>
+      <w:bCs/>
       <w:i/>
       <w:iCs/>
-      <w:color w:val="0F4761" w:themeColor="accent1" w:themeShade="BF"/>
+      <w:color w:val="F81B02" w:themeColor="accent1"/>
     </w:rPr>
   </w:style>
   <w:style w:type="character" w:customStyle="1" w:styleId="IntenseQuoteChar">
@@ -1953,11 +1886,13 @@
     <w:basedOn w:val="DefaultParagraphFont"/>
     <w:link w:val="IntenseQuote"/>
     <w:uiPriority w:val="30"/>
-    <w:rsid w:val="006F3B01"/>
-    <w:rPr>
+    <w:rsid w:val="004D3FBA"/>
+    <w:rPr>
+      <w:b/>
+      <w:bCs/>
       <w:i/>
       <w:iCs/>
-      <w:color w:val="0F4761" w:themeColor="accent1" w:themeShade="BF"/>
+      <w:color w:val="F81B02" w:themeColor="accent1"/>
     </w:rPr>
   </w:style>
   <w:style w:type="character" w:styleId="IntenseReference">
@@ -1965,22 +1900,159 @@
     <w:basedOn w:val="DefaultParagraphFont"/>
     <w:uiPriority w:val="32"/>
     <w:qFormat/>
-    <w:rsid w:val="006F3B01"/>
+    <w:rsid w:val="004D3FBA"/>
     <w:rPr>
       <w:b/>
       <w:bCs/>
       <w:smallCaps/>
-      <w:color w:val="0F4761" w:themeColor="accent1" w:themeShade="BF"/>
+      <w:color w:val="FC7715" w:themeColor="accent2"/>
       <w:spacing w:val="5"/>
+      <w:u w:val="single"/>
+    </w:rPr>
+  </w:style>
+  <w:style w:type="character" w:styleId="Hyperlink">
+    <w:name w:val="Hyperlink"/>
+    <w:basedOn w:val="DefaultParagraphFont"/>
+    <w:uiPriority w:val="99"/>
+    <w:unhideWhenUsed/>
+    <w:rsid w:val="007D0244"/>
+    <w:rPr>
+      <w:color w:val="FC5A1A" w:themeColor="hyperlink"/>
+      <w:u w:val="single"/>
+    </w:rPr>
+  </w:style>
+  <w:style w:type="character" w:styleId="UnresolvedMention">
+    <w:name w:val="Unresolved Mention"/>
+    <w:basedOn w:val="DefaultParagraphFont"/>
+    <w:uiPriority w:val="99"/>
+    <w:semiHidden/>
+    <w:unhideWhenUsed/>
+    <w:rsid w:val="007D0244"/>
+    <w:rPr>
+      <w:color w:val="605E5C"/>
+      <w:shd w:val="clear" w:color="auto" w:fill="E1DFDD"/>
+    </w:rPr>
+  </w:style>
+  <w:style w:type="paragraph" w:styleId="Caption">
+    <w:name w:val="caption"/>
+    <w:basedOn w:val="Normal"/>
+    <w:next w:val="Normal"/>
+    <w:uiPriority w:val="35"/>
+    <w:semiHidden/>
+    <w:unhideWhenUsed/>
+    <w:qFormat/>
+    <w:rsid w:val="004D3FBA"/>
+    <w:pPr>
+      <w:spacing w:line="240" w:lineRule="auto"/>
+    </w:pPr>
+    <w:rPr>
+      <w:b/>
+      <w:bCs/>
+      <w:color w:val="F81B02" w:themeColor="accent1"/>
+      <w:sz w:val="18"/>
+      <w:szCs w:val="18"/>
+    </w:rPr>
+  </w:style>
+  <w:style w:type="character" w:styleId="Strong">
+    <w:name w:val="Strong"/>
+    <w:basedOn w:val="DefaultParagraphFont"/>
+    <w:uiPriority w:val="22"/>
+    <w:qFormat/>
+    <w:rsid w:val="004D3FBA"/>
+    <w:rPr>
+      <w:b/>
+      <w:bCs/>
+    </w:rPr>
+  </w:style>
+  <w:style w:type="character" w:styleId="Emphasis">
+    <w:name w:val="Emphasis"/>
+    <w:basedOn w:val="DefaultParagraphFont"/>
+    <w:uiPriority w:val="20"/>
+    <w:qFormat/>
+    <w:rsid w:val="004D3FBA"/>
+    <w:rPr>
+      <w:i/>
+      <w:iCs/>
+    </w:rPr>
+  </w:style>
+  <w:style w:type="paragraph" w:styleId="NoSpacing">
+    <w:name w:val="No Spacing"/>
+    <w:uiPriority w:val="1"/>
+    <w:qFormat/>
+    <w:rsid w:val="004D3FBA"/>
+    <w:pPr>
+      <w:spacing w:after="0" w:line="240" w:lineRule="auto"/>
+    </w:pPr>
+  </w:style>
+  <w:style w:type="character" w:styleId="SubtleEmphasis">
+    <w:name w:val="Subtle Emphasis"/>
+    <w:basedOn w:val="DefaultParagraphFont"/>
+    <w:uiPriority w:val="19"/>
+    <w:qFormat/>
+    <w:rsid w:val="004D3FBA"/>
+    <w:rPr>
+      <w:i/>
+      <w:iCs/>
+      <w:color w:val="808080" w:themeColor="text1" w:themeTint="7F"/>
+    </w:rPr>
+  </w:style>
+  <w:style w:type="character" w:styleId="SubtleReference">
+    <w:name w:val="Subtle Reference"/>
+    <w:basedOn w:val="DefaultParagraphFont"/>
+    <w:uiPriority w:val="31"/>
+    <w:qFormat/>
+    <w:rsid w:val="004D3FBA"/>
+    <w:rPr>
+      <w:smallCaps/>
+      <w:color w:val="FC7715" w:themeColor="accent2"/>
+      <w:u w:val="single"/>
+    </w:rPr>
+  </w:style>
+  <w:style w:type="character" w:styleId="BookTitle">
+    <w:name w:val="Book Title"/>
+    <w:basedOn w:val="DefaultParagraphFont"/>
+    <w:uiPriority w:val="33"/>
+    <w:qFormat/>
+    <w:rsid w:val="004D3FBA"/>
+    <w:rPr>
+      <w:b/>
+      <w:bCs/>
+      <w:smallCaps/>
+      <w:spacing w:val="5"/>
+    </w:rPr>
+  </w:style>
+  <w:style w:type="paragraph" w:styleId="TOCHeading">
+    <w:name w:val="TOC Heading"/>
+    <w:basedOn w:val="Heading1"/>
+    <w:next w:val="Normal"/>
+    <w:uiPriority w:val="39"/>
+    <w:semiHidden/>
+    <w:unhideWhenUsed/>
+    <w:qFormat/>
+    <w:rsid w:val="004D3FBA"/>
+    <w:pPr>
+      <w:outlineLvl w:val="9"/>
+    </w:pPr>
+  </w:style>
+  <w:style w:type="character" w:styleId="FollowedHyperlink">
+    <w:name w:val="FollowedHyperlink"/>
+    <w:basedOn w:val="DefaultParagraphFont"/>
+    <w:uiPriority w:val="99"/>
+    <w:semiHidden/>
+    <w:unhideWhenUsed/>
+    <w:rsid w:val="004D3FBA"/>
+    <w:rPr>
+      <w:color w:val="B49E74" w:themeColor="followedHyperlink"/>
+      <w:u w:val="single"/>
     </w:rPr>
   </w:style>
 </w:styles>
 </file>
 
 <file path=word/theme/theme1.xml><?xml version="1.0" encoding="utf-8"?>
-<a:theme xmlns:a="http://schemas.openxmlformats.org/drawingml/2006/main" name="Office Theme">
+<a:theme xmlns:a="http://schemas.openxmlformats.org/drawingml/2006/main" name="Atlas">
   <a:themeElements>
-    <a:clrScheme name="Office">
+    <a:clrScheme name="Atlas">
       <a:dk1>
         <a:sysClr val="windowText" lastClr="000000"/>
       </a:dk1>
@@ -1988,44 +2060,44 @@
         <a:sysClr val="window" lastClr="FFFFFF"/>
       </a:lt1>
       <a:dk2>
-        <a:srgbClr val="0E2841"/>
+        <a:srgbClr val="454545"/>
       </a:dk2>
       <a:lt2>
-        <a:srgbClr val="E8E8E8"/>
+        <a:srgbClr val="E0E0E0"/>
       </a:lt2>
       <a:accent1>
-        <a:srgbClr val="156082"/>
+        <a:srgbClr val="F81B02"/>
       </a:accent1>
       <a:accent2>
-        <a:srgbClr val="E97132"/>
+        <a:srgbClr val="FC7715"/>
       </a:accent2>
       <a:accent3>
-        <a:srgbClr val="196B24"/>
+        <a:srgbClr val="AFBF41"/>
       </a:accent3>
       <a:accent4>
-        <a:srgbClr val="0F9ED5"/>
+        <a:srgbClr val="50C49F"/>
       </a:accent4>
       <a:accent5>
-        <a:srgbClr val="A02B93"/>
+        <a:srgbClr val="3B95C4"/>
       </a:accent5>
       <a:accent6>
-        <a:srgbClr val="4EA72E"/>
+        <a:srgbClr val="B560D4"/>
       </a:accent6>
       <a:hlink>
-        <a:srgbClr val="467886"/>
+        <a:srgbClr val="FC5A1A"/>
       </a:hlink>
       <a:folHlink>
-        <a:srgbClr val="96607D"/>
+        <a:srgbClr val="B49E74"/>
       </a:folHlink>
     </a:clrScheme>
-    <a:fontScheme name="Office">
+    <a:fontScheme name="Atlas">
       <a:majorFont>
-        <a:latin typeface="Aptos Display" panose="02110004020202020204"/>
+        <a:latin typeface="Calibri Light" panose="020F0302020204030204"/>
         <a:ea typeface=""/>
         <a:cs typeface=""/>
-        <a:font script="Jpan" typeface="游ゴシック Light"/>
+        <a:font script="Jpan" typeface="ＭＳ Ｐゴシック"/>
         <a:font script="Hang" typeface="맑은 고딕"/>
-        <a:font script="Hans" typeface="等线 Light"/>
+        <a:font script="Hans" typeface="宋体"/>
         <a:font script="Hant" typeface="新細明體"/>
         <a:font script="Arab" typeface="Times New Roman"/>
         <a:font script="Hebr" typeface="Times New Roman"/>
@@ -2053,31 +2125,14 @@
         <a:font script="Viet" typeface="Times New Roman"/>
         <a:font script="Uigh" typeface="Microsoft Uighur"/>
         <a:font script="Geor" typeface="Sylfaen"/>
-        <a:font script="Armn" typeface="Arial"/>
-        <a:font script="Bugi" typeface="Leelawadee UI"/>
-        <a:font script="Bopo" typeface="Microsoft JhengHei"/>
-        <a:font script="Java" typeface="Javanese Text"/>
-        <a:font script="Lisu" typeface="Segoe UI"/>
-        <a:font script="Mymr" typeface="Myanmar Text"/>
-        <a:font script="Nkoo" typeface="Ebrima"/>
-        <a:font script="Olck" typeface="Nirmala UI"/>
-        <a:font script="Osma" typeface="Ebrima"/>
-        <a:font script="Phag" typeface="Phagspa"/>
-        <a:font script="Syrn" typeface="Estrangelo Edessa"/>
-        <a:font script="Syrj" typeface="Estrangelo Edessa"/>
-        <a:font script="Syre" typeface="Estrangelo Edessa"/>
-        <a:font script="Sora" typeface="Nirmala UI"/>
-        <a:font script="Tale" typeface="Microsoft Tai Le"/>
-        <a:font script="Talu" typeface="Microsoft New Tai Lue"/>
-        <a:font script="Tfng" typeface="Ebrima"/>
       </a:majorFont>
       <a:minorFont>
-        <a:latin typeface="Aptos" panose="02110004020202020204"/>
+        <a:latin typeface="Rockwell" panose="02060603020205020403"/>
         <a:ea typeface=""/>
         <a:cs typeface=""/>
-        <a:font script="Jpan" typeface="游明朝"/>
+        <a:font script="Jpan" typeface="ＭＳ Ｐゴシック"/>
         <a:font script="Hang" typeface="맑은 고딕"/>
-        <a:font script="Hans" typeface="等线"/>
+        <a:font script="Hans" typeface="宋体"/>
         <a:font script="Hant" typeface="新細明體"/>
         <a:font script="Arab" typeface="Arial"/>
         <a:font script="Hebr" typeface="Arial"/>
@@ -2105,26 +2160,9 @@
         <a:font script="Viet" typeface="Arial"/>
         <a:font script="Uigh" typeface="Microsoft Uighur"/>
         <a:font script="Geor" typeface="Sylfaen"/>
-        <a:font script="Armn" typeface="Arial"/>
-        <a:font script="Bugi" typeface="Leelawadee UI"/>
-        <a:font script="Bopo" typeface="Microsoft JhengHei"/>
-        <a:font script="Java" typeface="Javanese Text"/>
-        <a:font script="Lisu" typeface="Segoe UI"/>
-        <a:font script="Mymr" typeface="Myanmar Text"/>
-        <a:font script="Nkoo" typeface="Ebrima"/>
-        <a:font script="Olck" typeface="Nirmala UI"/>
-        <a:font script="Osma" typeface="Ebrima"/>
-        <a:font script="Phag" typeface="Phagspa"/>
-        <a:font script="Syrn" typeface="Estrangelo Edessa"/>
-        <a:font script="Syrj" typeface="Estrangelo Edessa"/>
-        <a:font script="Syre" typeface="Estrangelo Edessa"/>
-        <a:font script="Sora" typeface="Nirmala UI"/>
-        <a:font script="Tale" typeface="Microsoft Tai Le"/>
-        <a:font script="Talu" typeface="Microsoft New Tai Lue"/>
-        <a:font script="Tfng" typeface="Ebrima"/>
       </a:minorFont>
     </a:fontScheme>
-    <a:fmtScheme name="Office">
+    <a:fmtScheme name="Atlas">
       <a:fillStyleLst>
         <a:solidFill>
           <a:schemeClr val="phClr"/>
@@ -2133,23 +2171,18 @@
           <a:gsLst>
             <a:gs pos="0">
               <a:schemeClr val="phClr">
+                <a:tint val="62000"/>
+                <a:alpha val="60000"/>
+                <a:satMod val="109000"/>
                 <a:lumMod val="110000"/>
-                <a:satMod val="105000"/>
-                <a:tint val="67000"/>
-              </a:schemeClr>
-            </a:gs>
-            <a:gs pos="50000">
-              <a:schemeClr val="phClr">
-                <a:lumMod val="105000"/>
-                <a:satMod val="103000"/>
-                <a:tint val="73000"/>
               </a:schemeClr>
             </a:gs>
             <a:gs pos="100000">
               <a:schemeClr val="phClr">
-                <a:lumMod val="105000"/>
+                <a:tint val="78000"/>
+                <a:alpha val="92000"/>
                 <a:satMod val="109000"/>
-                <a:tint val="81000"/>
+                <a:lumMod val="100000"/>
               </a:schemeClr>
             </a:gs>
           </a:gsLst>
@@ -2159,23 +2192,23 @@
           <a:gsLst>
             <a:gs pos="0">
               <a:schemeClr val="phClr">
-                <a:satMod val="103000"/>
-                <a:lumMod val="102000"/>
-                <a:tint val="94000"/>
+                <a:tint val="98000"/>
+                <a:satMod val="110000"/>
+                <a:lumMod val="104000"/>
               </a:schemeClr>
             </a:gs>
-            <a:gs pos="50000">
+            <a:gs pos="69000">
               <a:schemeClr val="phClr">
-                <a:satMod val="110000"/>
-                <a:lumMod val="100000"/>
-                <a:shade val="100000"/>
+                <a:shade val="84000"/>
+                <a:satMod val="130000"/>
+                <a:lumMod val="92000"/>
               </a:schemeClr>
             </a:gs>
             <a:gs pos="100000">
               <a:schemeClr val="phClr">
-                <a:lumMod val="99000"/>
-                <a:satMod val="120000"/>
-                <a:shade val="78000"/>
+                <a:shade val="76000"/>
+                <a:satMod val="130000"/>
+                <a:lumMod val="88000"/>
               </a:schemeClr>
             </a:gs>
           </a:gsLst>
@@ -2183,26 +2216,27 @@
         </a:gradFill>
       </a:fillStyleLst>
       <a:lnStyleLst>
-        <a:ln w="12700" cap="flat" cmpd="sng" algn="ctr">
+        <a:ln w="9525" cap="flat" cmpd="sng" algn="ctr">
           <a:solidFill>
-            <a:schemeClr val="phClr"/>
+            <a:schemeClr val="phClr">
+              <a:shade val="90000"/>
+            </a:schemeClr>
           </a:solidFill>
           <a:prstDash val="solid"/>
-          <a:miter lim="800000"/>
         </a:ln>
-        <a:ln w="19050" cap="flat" cmpd="sng" algn="ctr">
+        <a:ln w="15875" cap="flat" cmpd="sng" algn="ctr">
           <a:solidFill>
-            <a:schemeClr val="phClr"/>
+            <a:schemeClr val="phClr">
+              <a:shade val="90000"/>
+            </a:schemeClr>
           </a:solidFill>
           <a:prstDash val="solid"/>
-          <a:miter lim="800000"/>
         </a:ln>
         <a:ln w="25400" cap="flat" cmpd="sng" algn="ctr">
           <a:solidFill>
             <a:schemeClr val="phClr"/>
           </a:solidFill>
           <a:prstDash val="solid"/>
-          <a:miter lim="800000"/>
         </a:ln>
       </a:lnStyleLst>
       <a:effectStyleLst>
@@ -2214,12 +2248,21 @@
         </a:effectStyle>
         <a:effectStyle>
           <a:effectLst>
-            <a:outerShdw blurRad="57150" dist="19050" dir="5400000" algn="ctr" rotWithShape="0">
+            <a:outerShdw blurRad="38100" dist="25400" dir="5400000" rotWithShape="0">
               <a:srgbClr val="000000">
-                <a:alpha val="63000"/>
+                <a:alpha val="75000"/>
               </a:srgbClr>
             </a:outerShdw>
           </a:effectLst>
+          <a:scene3d>
+            <a:camera prst="orthographicFront">
+              <a:rot lat="0" lon="0" rev="0"/>
+            </a:camera>
+            <a:lightRig rig="threePt" dir="tl"/>
+          </a:scene3d>
+          <a:sp3d>
+            <a:bevelT w="0" h="0"/>
+          </a:sp3d>
         </a:effectStyle>
       </a:effectStyleLst>
       <a:bgFillStyleLst>
@@ -2227,66 +2270,37 @@
           <a:schemeClr val="phClr"/>
         </a:solidFill>
         <a:solidFill>
-          <a:schemeClr val="phClr">
-            <a:tint val="95000"/>
-            <a:satMod val="170000"/>
-          </a:schemeClr>
+          <a:schemeClr val="phClr"/>
         </a:solidFill>
         <a:gradFill rotWithShape="1">
           <a:gsLst>
-            <a:gs pos="0">
+            <a:gs pos="10000">
               <a:schemeClr val="phClr">
-                <a:tint val="93000"/>
-                <a:satMod val="150000"/>
-                <a:shade val="98000"/>
-                <a:lumMod val="102000"/>
-              </a:schemeClr>
-            </a:gs>
-            <a:gs pos="50000">
-              <a:schemeClr val="phClr">
-                <a:tint val="98000"/>
-                <a:satMod val="130000"/>
-                <a:shade val="90000"/>
-                <a:lumMod val="103000"/>
+                <a:tint val="94000"/>
+                <a:lumMod val="116000"/>
               </a:schemeClr>
             </a:gs>
             <a:gs pos="100000">
               <a:schemeClr val="phClr">
-                <a:shade val="63000"/>
-                <a:satMod val="120000"/>
+                <a:tint val="98000"/>
+                <a:shade val="86000"/>
+                <a:satMod val="90000"/>
+                <a:lumMod val="88000"/>
               </a:schemeClr>
             </a:gs>
           </a:gsLst>
-          <a:lin ang="5400000" scaled="0"/>
+          <a:path path="circle">
+            <a:fillToRect l="50000" t="15000" r="50000" b="169000"/>
+          </a:path>
         </a:gradFill>
       </a:bgFillStyleLst>
     </a:fmtScheme>
   </a:themeElements>
-  <a:objectDefaults>
-    <a:lnDef>
-      <a:spPr/>
-      <a:bodyPr/>
-      <a:lstStyle/>
-      <a:style>
-        <a:lnRef idx="2">
-          <a:schemeClr val="accent1"/>
-        </a:lnRef>
-        <a:fillRef idx="0">
-          <a:schemeClr val="accent1"/>
-        </a:fillRef>
-        <a:effectRef idx="1">
-          <a:schemeClr val="accent1"/>
-        </a:effectRef>
-        <a:fontRef idx="minor">
-          <a:schemeClr val="tx1"/>
-        </a:fontRef>
-      </a:style>
-    </a:lnDef>
-  </a:objectDefaults>
+  <a:objectDefaults/>
   <a:extraClrSchemeLst/>
   <a:extLst>
     <a:ext uri="{05A4C25C-085E-4340-85A3-A5531E510DB2}">
-      <thm15:themeFamily xmlns:thm15="http://schemas.microsoft.com/office/thememl/2012/main" name="Office Theme" id="{2E142A2C-CD16-42D6-873A-C26D2A0506FA}" vid="{1BDDFF52-6CD6-40A5-AB3C-68EB2F1E4D0A}"/>
+      <thm15:themeFamily xmlns:thm15="http://schemas.microsoft.com/office/thememl/2012/main" name="Atlas" id="{5156B0E4-0EB1-49FE-A26B-15F6F698AEC6}" vid="{508F7963-D0B5-43F7-BB2C-FCE3009C08EC}"/>
     </a:ext>
   </a:extLst>
 </a:theme>

</xml_diff>